<commit_message>
Reflection docs: add colon after Name / Period / Date in the header
Name:/Period:/Date: (EN) and Nombre:/Periodo:/Fecha: (ES), still teal.
Regenerated all 10 modules, EN + ES, from the canonical builder.

Co-Authored-By: Claude Opus 4.8 <noreply@anthropic.com>
</commit_message>
<xml_diff>
--- a/assets/course-documents/Build-Your-Own-Preset-Reflection-EN.docx
+++ b/assets/course-documents/Build-Your-Own-Preset-Reflection-EN.docx
@@ -117,7 +117,7 @@
           <w:sz w:val="22"/>
           <w:szCs w:val="22"/>
         </w:rPr>
-        <w:t xml:space="preserve">Name</w:t>
+        <w:t xml:space="preserve">Name:</w:t>
       </w:r>
       <w:r>
         <w:rPr>
@@ -128,7 +128,7 @@
           <w:sz w:val="22"/>
           <w:szCs w:val="22"/>
         </w:rPr>
-        <w:t xml:space="preserve">	Period</w:t>
+        <w:t xml:space="preserve">	Period:</w:t>
       </w:r>
       <w:r>
         <w:rPr>
@@ -139,7 +139,7 @@
           <w:sz w:val="22"/>
           <w:szCs w:val="22"/>
         </w:rPr>
-        <w:t xml:space="preserve">	Date</w:t>
+        <w:t xml:space="preserve">	Date:</w:t>
       </w:r>
     </w:p>
     <w:p>

</xml_diff>